<commit_message>
se realizan carpetas en el views
</commit_message>
<xml_diff>
--- a/core/templates/rrhh/contratos/test.docx
+++ b/core/templates/rrhh/contratos/test.docx
@@ -4953,347 +4953,344 @@
     <w:p>
       <w:pPr>
         <w:ind w:left="-142" w:right="-518"/>
+        <w:rPr>
+          <w:u w:val="single"/>
+        </w:rPr>
       </w:pPr>
     </w:p>
+    <w:tbl>
+      <w:tblPr>
+        <w:tblStyle w:val="Tablaconcuadrcula"/>
+        <w:tblpPr w:leftFromText="141" w:rightFromText="141" w:vertAnchor="text" w:horzAnchor="margin" w:tblpY="82"/>
+        <w:tblW w:w="9635" w:type="dxa"/>
+        <w:tblBorders>
+          <w:top w:val="none" w:sz="0" w:space="0" w:color="auto"/>
+          <w:left w:val="none" w:sz="0" w:space="0" w:color="auto"/>
+          <w:bottom w:val="none" w:sz="0" w:space="0" w:color="auto"/>
+          <w:right w:val="none" w:sz="0" w:space="0" w:color="auto"/>
+          <w:insideH w:val="none" w:sz="0" w:space="0" w:color="auto"/>
+          <w:insideV w:val="none" w:sz="0" w:space="0" w:color="auto"/>
+        </w:tblBorders>
+        <w:tblLook w:val="04A0" w:firstRow="1" w:lastRow="0" w:firstColumn="1" w:lastColumn="0" w:noHBand="0" w:noVBand="1"/>
+      </w:tblPr>
+      <w:tblGrid>
+        <w:gridCol w:w="5240"/>
+        <w:gridCol w:w="4395"/>
+      </w:tblGrid>
+      <w:tr>
+        <w:trPr>
+          <w:trHeight w:val="1551"/>
+        </w:trPr>
+        <w:tc>
+          <w:tcPr>
+            <w:tcW w:w="5240" w:type="dxa"/>
+          </w:tcPr>
+          <w:p>
+            <w:pPr>
+              <w:ind w:right="-518"/>
+              <w:rPr>
+                <w:u w:val="single"/>
+              </w:rPr>
+            </w:pPr>
+            <w:r>
+              <w:t>Por</w:t>
+            </w:r>
+            <w:r>
+              <w:rPr>
+                <w:spacing w:val="-3"/>
+              </w:rPr>
+              <w:t xml:space="preserve"> </w:t>
+            </w:r>
+            <w:r>
+              <w:t>el</w:t>
+            </w:r>
+            <w:r>
+              <w:rPr>
+                <w:spacing w:val="-2"/>
+              </w:rPr>
+              <w:t xml:space="preserve"> </w:t>
+            </w:r>
+            <w:r>
+              <w:t>EMPLEADOR</w:t>
+            </w:r>
+          </w:p>
+        </w:tc>
+        <w:tc>
+          <w:tcPr>
+            <w:tcW w:w="4395" w:type="dxa"/>
+          </w:tcPr>
+          <w:p>
+            <w:pPr>
+              <w:ind w:right="-518"/>
+              <w:rPr>
+                <w:u w:val="single"/>
+              </w:rPr>
+            </w:pPr>
+            <w:r>
+              <w:t>EL (LA)</w:t>
+            </w:r>
+            <w:r>
+              <w:rPr>
+                <w:spacing w:val="-1"/>
+              </w:rPr>
+              <w:t xml:space="preserve"> </w:t>
+            </w:r>
+            <w:r>
+              <w:t>TRABAJADOR(A)</w:t>
+            </w:r>
+          </w:p>
+        </w:tc>
+      </w:tr>
+      <w:tr>
+        <w:trPr>
+          <w:trHeight w:val="275"/>
+        </w:trPr>
+        <w:tc>
+          <w:tcPr>
+            <w:tcW w:w="5240" w:type="dxa"/>
+          </w:tcPr>
+          <w:p>
+            <w:pPr>
+              <w:ind w:right="-518"/>
+              <w:rPr>
+                <w:u w:val="single"/>
+              </w:rPr>
+            </w:pPr>
+            <w:r>
+              <w:rPr>
+                <w:b/>
+                <w:u w:val="single"/>
+              </w:rPr>
+              <w:tab/>
+            </w:r>
+            <w:r>
+              <w:rPr>
+                <w:b/>
+              </w:rPr>
+              <w:t>_</w:t>
+            </w:r>
+            <w:r>
+              <w:rPr>
+                <w:b/>
+                <w:u w:val="single"/>
+              </w:rPr>
+              <w:t xml:space="preserve"> </w:t>
+            </w:r>
+            <w:r>
+              <w:rPr>
+                <w:b/>
+                <w:u w:val="single"/>
+              </w:rPr>
+              <w:tab/>
+            </w:r>
+            <w:r>
+              <w:rPr>
+                <w:b/>
+              </w:rPr>
+              <w:t>_</w:t>
+            </w:r>
+            <w:r>
+              <w:rPr>
+                <w:b/>
+              </w:rPr>
+              <w:t>________________</w:t>
+            </w:r>
+            <w:r>
+              <w:rPr>
+                <w:b/>
+              </w:rPr>
+              <w:tab/>
+            </w:r>
+          </w:p>
+        </w:tc>
+        <w:tc>
+          <w:tcPr>
+            <w:tcW w:w="4395" w:type="dxa"/>
+          </w:tcPr>
+          <w:p>
+            <w:pPr>
+              <w:ind w:right="-518"/>
+              <w:rPr>
+                <w:u w:val="single"/>
+              </w:rPr>
+            </w:pPr>
+            <w:r>
+              <w:rPr>
+                <w:b/>
+              </w:rPr>
+              <w:t>_</w:t>
+            </w:r>
+            <w:r>
+              <w:rPr>
+                <w:b/>
+                <w:u w:val="single"/>
+              </w:rPr>
+              <w:tab/>
+            </w:r>
+            <w:r>
+              <w:rPr>
+                <w:b/>
+              </w:rPr>
+              <w:t>____________________</w:t>
+            </w:r>
+          </w:p>
+        </w:tc>
+      </w:tr>
+      <w:tr>
+        <w:tc>
+          <w:tcPr>
+            <w:tcW w:w="5240" w:type="dxa"/>
+          </w:tcPr>
+          <w:p>
+            <w:pPr>
+              <w:ind w:right="-518"/>
+              <w:rPr>
+                <w:u w:val="single"/>
+              </w:rPr>
+            </w:pPr>
+            <w:r>
+              <w:rPr>
+                <w:b/>
+                <w:sz w:val="20"/>
+                <w:szCs w:val="20"/>
+              </w:rPr>
+              <w:t>MAYRA ALEJANDRA OCORO POSSU</w:t>
+            </w:r>
+            <w:r>
+              <w:rPr>
+                <w:b/>
+                <w:sz w:val="20"/>
+                <w:szCs w:val="20"/>
+              </w:rPr>
+              <w:tab/>
+            </w:r>
+          </w:p>
+        </w:tc>
+        <w:tc>
+          <w:tcPr>
+            <w:tcW w:w="4395" w:type="dxa"/>
+          </w:tcPr>
+          <w:p>
+            <w:pPr>
+              <w:ind w:left="-142" w:right="-518"/>
+              <w:rPr>
+                <w:color w:val="000000"/>
+                <w:lang w:val="es-CO"/>
+              </w:rPr>
+            </w:pPr>
+            <w:r>
+              <w:rPr>
+                <w:color w:val="000000"/>
+                <w:lang w:val="es-CO"/>
+              </w:rPr>
+              <w:t xml:space="preserve"> </w:t>
+            </w:r>
+            <w:r>
+              <w:rPr>
+                <w:color w:val="000000"/>
+                <w:lang w:val="es-CO"/>
+              </w:rPr>
+              <w:t>{{empleado.nombre_completo }}</w:t>
+            </w:r>
+            <w:r>
+              <w:rPr>
+                <w:b/>
+                <w:color w:val="EE0000"/>
+                <w:sz w:val="20"/>
+                <w:szCs w:val="20"/>
+              </w:rPr>
+              <w:t xml:space="preserve"> </w:t>
+            </w:r>
+          </w:p>
+          <w:p>
+            <w:pPr>
+              <w:ind w:right="-518"/>
+              <w:rPr>
+                <w:u w:val="single"/>
+              </w:rPr>
+            </w:pPr>
+          </w:p>
+        </w:tc>
+      </w:tr>
+      <w:tr>
+        <w:tc>
+          <w:tcPr>
+            <w:tcW w:w="5240" w:type="dxa"/>
+          </w:tcPr>
+          <w:p>
+            <w:pPr>
+              <w:ind w:right="-518"/>
+              <w:rPr>
+                <w:u w:val="single"/>
+              </w:rPr>
+            </w:pPr>
+            <w:r>
+              <w:rPr>
+                <w:b/>
+                <w:sz w:val="20"/>
+                <w:szCs w:val="20"/>
+              </w:rPr>
+              <w:t>C. C. No. 1.060.416.368 de</w:t>
+            </w:r>
+            <w:r>
+              <w:rPr>
+                <w:b/>
+                <w:spacing w:val="-4"/>
+                <w:sz w:val="20"/>
+                <w:szCs w:val="20"/>
+              </w:rPr>
+              <w:t xml:space="preserve"> </w:t>
+            </w:r>
+            <w:r>
+              <w:rPr>
+                <w:b/>
+                <w:sz w:val="20"/>
+                <w:szCs w:val="20"/>
+              </w:rPr>
+              <w:t>Padilla</w:t>
+            </w:r>
+          </w:p>
+        </w:tc>
+        <w:tc>
+          <w:tcPr>
+            <w:tcW w:w="4395" w:type="dxa"/>
+          </w:tcPr>
+          <w:p>
+            <w:pPr>
+              <w:ind w:right="-518"/>
+              <w:rPr>
+                <w:u w:val="single"/>
+              </w:rPr>
+            </w:pPr>
+            <w:r>
+              <w:rPr>
+                <w:b/>
+                <w:sz w:val="20"/>
+                <w:szCs w:val="20"/>
+              </w:rPr>
+              <w:t>C. C. No.</w:t>
+            </w:r>
+            <w:r>
+              <w:rPr>
+                <w:color w:val="000000"/>
+                <w:lang w:val="es-CO"/>
+              </w:rPr>
+              <w:t xml:space="preserve"> </w:t>
+            </w:r>
+            <w:r>
+              <w:rPr>
+                <w:color w:val="000000"/>
+                <w:lang w:val="es-CO"/>
+              </w:rPr>
+              <w:t>{{ empleado.documento }}</w:t>
+            </w:r>
+          </w:p>
+        </w:tc>
+      </w:tr>
+    </w:tbl>
     <w:p>
       <w:pPr>
-        <w:ind w:left="-142" w:right="-518"/>
-      </w:pPr>
-      <w:r>
-        <w:t>Por</w:t>
-      </w:r>
-      <w:r>
-        <w:rPr>
-          <w:spacing w:val="-3"/>
-        </w:rPr>
-        <w:t xml:space="preserve"> </w:t>
-      </w:r>
-      <w:r>
-        <w:t>el</w:t>
-      </w:r>
-      <w:r>
-        <w:rPr>
-          <w:spacing w:val="-2"/>
-        </w:rPr>
-        <w:t xml:space="preserve"> </w:t>
-      </w:r>
-      <w:r>
-        <w:t>EMPLEADOR</w:t>
-      </w:r>
-      <w:r>
-        <w:tab/>
-      </w:r>
-      <w:r>
-        <w:tab/>
-      </w:r>
-      <w:r>
-        <w:tab/>
-      </w:r>
-      <w:r>
-        <w:tab/>
-      </w:r>
-      <w:r>
-        <w:tab/>
-      </w:r>
-      <w:r>
-        <w:tab/>
-        <w:t>EL (LA)</w:t>
-      </w:r>
-      <w:r>
-        <w:rPr>
-          <w:spacing w:val="-1"/>
-        </w:rPr>
-        <w:t xml:space="preserve"> </w:t>
-      </w:r>
-      <w:r>
-        <w:t>TRABAJADOR(A)</w:t>
-      </w:r>
-    </w:p>
-    <w:p>
-      <w:pPr>
-        <w:ind w:left="-142" w:right="-518"/>
-        <w:rPr>
-          <w:b/>
-        </w:rPr>
-      </w:pPr>
-    </w:p>
-    <w:p>
-      <w:pPr>
-        <w:ind w:left="-142" w:right="-518"/>
-        <w:rPr>
-          <w:b/>
-        </w:rPr>
-      </w:pPr>
-      <w:r>
-        <w:rPr>
-          <w:b/>
-          <w:noProof/>
-          <w:lang w:val="es-CO" w:eastAsia="es-CO"/>
-        </w:rPr>
-        <w:t xml:space="preserve">                  </w:t>
-      </w:r>
-    </w:p>
-    <w:p>
-      <w:pPr>
-        <w:ind w:left="-142" w:right="-518"/>
-        <w:rPr>
-          <w:b/>
-        </w:rPr>
-      </w:pPr>
-      <w:r>
-        <w:rPr>
-          <w:b/>
-          <w:w w:val="99"/>
-          <w:u w:val="single"/>
-        </w:rPr>
-        <w:t xml:space="preserve"> </w:t>
-      </w:r>
-      <w:r>
-        <w:rPr>
-          <w:b/>
-          <w:u w:val="single"/>
-        </w:rPr>
-        <w:tab/>
-      </w:r>
-      <w:r>
-        <w:rPr>
-          <w:b/>
-        </w:rPr>
-        <w:t>_</w:t>
-      </w:r>
-      <w:r>
-        <w:rPr>
-          <w:b/>
-          <w:u w:val="single"/>
-        </w:rPr>
-        <w:t xml:space="preserve"> </w:t>
-      </w:r>
-      <w:r>
-        <w:rPr>
-          <w:b/>
-          <w:u w:val="single"/>
-        </w:rPr>
-        <w:tab/>
-      </w:r>
-      <w:r>
-        <w:rPr>
-          <w:b/>
-        </w:rPr>
-        <w:t>_</w:t>
-      </w:r>
-      <w:r>
-        <w:rPr>
-          <w:b/>
-        </w:rPr>
-        <w:t>________________</w:t>
-      </w:r>
-      <w:r>
-        <w:rPr>
-          <w:b/>
-        </w:rPr>
-        <w:tab/>
-      </w:r>
-      <w:r>
-        <w:rPr>
-          <w:b/>
-        </w:rPr>
-        <w:tab/>
-      </w:r>
-      <w:r>
-        <w:rPr>
-          <w:b/>
-        </w:rPr>
-        <w:tab/>
-      </w:r>
-      <w:r>
-        <w:rPr>
-          <w:b/>
-        </w:rPr>
-        <w:tab/>
-      </w:r>
-      <w:r>
-        <w:rPr>
-          <w:b/>
-        </w:rPr>
-        <w:tab/>
-      </w:r>
-      <w:r>
-        <w:rPr>
-          <w:b/>
-        </w:rPr>
-        <w:t>_</w:t>
-      </w:r>
-      <w:r>
-        <w:rPr>
-          <w:b/>
-          <w:u w:val="single"/>
-        </w:rPr>
-        <w:tab/>
-      </w:r>
-      <w:r>
-        <w:rPr>
-          <w:b/>
-        </w:rPr>
-        <w:t>____________________</w:t>
-      </w:r>
-    </w:p>
-    <w:p>
-      <w:pPr>
-        <w:ind w:left="-142" w:right="-518"/>
-        <w:rPr>
-          <w:color w:val="000000"/>
-          <w:lang w:val="es-CO"/>
-        </w:rPr>
-      </w:pPr>
-      <w:r>
-        <w:rPr>
-          <w:b/>
-          <w:sz w:val="20"/>
-          <w:szCs w:val="20"/>
-        </w:rPr>
-        <w:t>MAYRA ALEJANDRA OCORO POSSU</w:t>
-      </w:r>
-      <w:r>
-        <w:rPr>
-          <w:b/>
-          <w:sz w:val="20"/>
-          <w:szCs w:val="20"/>
-        </w:rPr>
-        <w:tab/>
-      </w:r>
-      <w:r>
-        <w:rPr>
-          <w:b/>
-          <w:sz w:val="20"/>
-          <w:szCs w:val="20"/>
-        </w:rPr>
-        <w:tab/>
-      </w:r>
-      <w:r>
-        <w:rPr>
-          <w:b/>
-          <w:sz w:val="20"/>
-          <w:szCs w:val="20"/>
-        </w:rPr>
-        <w:tab/>
-      </w:r>
-      <w:r>
-        <w:rPr>
-          <w:b/>
-          <w:sz w:val="20"/>
-          <w:szCs w:val="20"/>
-        </w:rPr>
-        <w:tab/>
-      </w:r>
-      <w:r>
-        <w:rPr>
-          <w:color w:val="000000"/>
-          <w:lang w:val="es-CO"/>
-        </w:rPr>
-        <w:t>{{empleado.nombre_completo }}</w:t>
-      </w:r>
-      <w:r>
-        <w:rPr>
-          <w:b/>
-          <w:color w:val="EE0000"/>
-          <w:sz w:val="20"/>
-          <w:szCs w:val="20"/>
-        </w:rPr>
-        <w:t xml:space="preserve"> </w:t>
-      </w:r>
-    </w:p>
-    <w:p>
-      <w:pPr>
-        <w:ind w:left="-142" w:right="-518"/>
-        <w:rPr>
-          <w:color w:val="EE0000"/>
-          <w:sz w:val="20"/>
-          <w:szCs w:val="20"/>
-        </w:rPr>
-      </w:pPr>
-      <w:r>
-        <w:rPr>
-          <w:b/>
-          <w:sz w:val="20"/>
-          <w:szCs w:val="20"/>
-        </w:rPr>
-        <w:t>C. C. No. 1.060.416.368 de</w:t>
-      </w:r>
-      <w:r>
-        <w:rPr>
-          <w:b/>
-          <w:spacing w:val="-4"/>
-          <w:sz w:val="20"/>
-          <w:szCs w:val="20"/>
-        </w:rPr>
-        <w:t xml:space="preserve"> </w:t>
-      </w:r>
-      <w:r>
-        <w:rPr>
-          <w:b/>
-          <w:sz w:val="20"/>
-          <w:szCs w:val="20"/>
-        </w:rPr>
-        <w:t>Padilla</w:t>
-      </w:r>
-      <w:r>
-        <w:rPr>
-          <w:b/>
-          <w:sz w:val="20"/>
-          <w:szCs w:val="20"/>
-        </w:rPr>
-        <w:tab/>
-      </w:r>
-      <w:r>
-        <w:rPr>
-          <w:b/>
-          <w:sz w:val="20"/>
-          <w:szCs w:val="20"/>
-        </w:rPr>
-        <w:tab/>
-      </w:r>
-      <w:r>
-        <w:rPr>
-          <w:b/>
-          <w:sz w:val="20"/>
-          <w:szCs w:val="20"/>
-        </w:rPr>
-        <w:tab/>
-      </w:r>
-      <w:r>
-        <w:rPr>
-          <w:b/>
-          <w:sz w:val="20"/>
-          <w:szCs w:val="20"/>
-        </w:rPr>
-        <w:tab/>
-      </w:r>
-      <w:r>
-        <w:rPr>
-          <w:b/>
-          <w:sz w:val="20"/>
-          <w:szCs w:val="20"/>
-        </w:rPr>
-        <w:t>C. C. No.</w:t>
-      </w:r>
-      <w:r>
-        <w:rPr>
-          <w:color w:val="000000"/>
-          <w:lang w:val="es-CO"/>
-        </w:rPr>
-        <w:t xml:space="preserve"> </w:t>
-      </w:r>
-      <w:r>
-        <w:rPr>
-          <w:color w:val="000000"/>
-          <w:lang w:val="es-CO"/>
-        </w:rPr>
-        <w:t>{{ empleado.documento }}</w:t>
-      </w:r>
-    </w:p>
-    <w:p>
-      <w:pPr>
-        <w:ind w:left="-142" w:right="-518"/>
+        <w:ind w:right="-518"/>
       </w:pPr>
     </w:p>
     <w:sectPr>

</xml_diff>